<commit_message>
feat: add SWIFT code for bank accounts
</commit_message>
<xml_diff>
--- a/apps/api/src/modules/applications/templates/arf-deed-of-assignment.docx
+++ b/apps/api/src/modules/applications/templates/arf-deed-of-assignment.docx
@@ -1964,25 +1964,7 @@
           <w:sz w:val="20"/>
           <w:szCs w:val="20"/>
         </w:rPr>
-        <w:t xml:space="preserve"> representatives of the Assignor or the Assignor. In this regard, the Assignor agrees that no claims shall be made by the Assignor or on its behalf in respect to any losses, costs and expenses incurred by the Assignor </w:t>
-      </w:r>
-      <w:proofErr w:type="gramStart"/>
-      <w:r>
-        <w:rPr>
-          <w:rFonts w:ascii="Arial" w:hAnsi="Arial" w:cs="Arial"/>
-          <w:sz w:val="20"/>
-          <w:szCs w:val="20"/>
-        </w:rPr>
-        <w:t>as a result of</w:t>
-      </w:r>
-      <w:proofErr w:type="gramEnd"/>
-      <w:r>
-        <w:rPr>
-          <w:rFonts w:ascii="Arial" w:hAnsi="Arial" w:cs="Arial"/>
-          <w:sz w:val="20"/>
-          <w:szCs w:val="20"/>
-        </w:rPr>
-        <w:t xml:space="preserve"> such </w:t>
+        <w:t xml:space="preserve"> representatives of the Assignor or the Assignor. In this regard, the Assignor agrees that no claims shall be made by the Assignor or on its behalf in respect to any losses, costs and expenses incurred by the Assignor as a result of such </w:t>
       </w:r>
       <w:proofErr w:type="spellStart"/>
       <w:r>
@@ -2238,25 +2220,7 @@
           <w:sz w:val="20"/>
           <w:szCs w:val="20"/>
         </w:rPr>
-        <w:t xml:space="preserve"> have not acquired any right of set-off or </w:t>
-      </w:r>
-      <w:proofErr w:type="gramStart"/>
-      <w:r>
-        <w:rPr>
-          <w:rFonts w:ascii="Arial" w:hAnsi="Arial" w:cs="Arial"/>
-          <w:sz w:val="20"/>
-          <w:szCs w:val="20"/>
-        </w:rPr>
-        <w:t>counter-claim</w:t>
-      </w:r>
-      <w:proofErr w:type="gramEnd"/>
-      <w:r>
-        <w:rPr>
-          <w:rFonts w:ascii="Arial" w:hAnsi="Arial" w:cs="Arial"/>
-          <w:sz w:val="20"/>
-          <w:szCs w:val="20"/>
-        </w:rPr>
-        <w:t xml:space="preserve"> against the Assignor in respect of the Receivables or any portion thereof and the Assignor shall not door omit to do any actor thing which could result in the </w:t>
+        <w:t xml:space="preserve"> have not acquired any right of set-off or counter-claim against the Assignor in respect of the Receivables or any portion thereof and the Assignor shall not door omit to do any actor thing which could result in the </w:t>
       </w:r>
       <w:r>
         <w:rPr>
@@ -2342,25 +2306,7 @@
           <w:sz w:val="20"/>
           <w:szCs w:val="20"/>
         </w:rPr>
-        <w:t xml:space="preserve">that there </w:t>
-      </w:r>
-      <w:proofErr w:type="gramStart"/>
-      <w:r>
-        <w:rPr>
-          <w:rFonts w:ascii="Arial" w:hAnsi="Arial" w:cs="Arial"/>
-          <w:sz w:val="20"/>
-          <w:szCs w:val="20"/>
-        </w:rPr>
-        <w:t>are</w:t>
-      </w:r>
-      <w:proofErr w:type="gramEnd"/>
-      <w:r>
-        <w:rPr>
-          <w:rFonts w:ascii="Arial" w:hAnsi="Arial" w:cs="Arial"/>
-          <w:sz w:val="20"/>
-          <w:szCs w:val="20"/>
-        </w:rPr>
-        <w:t xml:space="preserve"> no material adverse change in the financial condition, operating environment, management of the Assignor or other conditions which will materially affect the ability of the Assignor to perform its obligations under this Assignment;</w:t>
+        <w:t>that there are no material adverse change in the financial condition, operating environment, management of the Assignor or other conditions which will materially affect the ability of the Assignor to perform its obligations under this Assignment;</w:t>
       </w:r>
     </w:p>
     <w:p>
@@ -2900,23 +2846,13 @@
         </w:rPr>
         <w:tab/>
       </w:r>
-      <w:proofErr w:type="gramStart"/>
-      <w:r>
-        <w:rPr>
-          <w:rFonts w:ascii="Arial" w:hAnsi="Arial" w:cs="Arial"/>
-          <w:sz w:val="20"/>
-          <w:szCs w:val="20"/>
-        </w:rPr>
-        <w:t>For the purpose of</w:t>
-      </w:r>
-      <w:proofErr w:type="gramEnd"/>
-      <w:r>
-        <w:rPr>
-          <w:rFonts w:ascii="Arial" w:hAnsi="Arial" w:cs="Arial"/>
-          <w:sz w:val="20"/>
-          <w:szCs w:val="20"/>
-        </w:rPr>
-        <w:t xml:space="preserve"> this clause, "obligation" includes any obligation whether matured or unmatured, actual or contingent, present or future. If the amount of any such obligation is unascertained, </w:t>
+      <w:r>
+        <w:rPr>
+          <w:rFonts w:ascii="Arial" w:hAnsi="Arial" w:cs="Arial"/>
+          <w:sz w:val="20"/>
+          <w:szCs w:val="20"/>
+        </w:rPr>
+        <w:t xml:space="preserve">For the purpose of this clause, "obligation" includes any obligation whether matured or unmatured, actual or contingent, present or future. If the amount of any such obligation is unascertained, </w:t>
       </w:r>
       <w:r>
         <w:rPr>
@@ -3144,25 +3080,7 @@
           <w:sz w:val="20"/>
           <w:szCs w:val="20"/>
         </w:rPr>
-        <w:t xml:space="preserve">, the provisions of this Assignment and/or the Security Documents and the Assignor hereby expressly consents to </w:t>
-      </w:r>
-      <w:proofErr w:type="gramStart"/>
-      <w:r>
-        <w:rPr>
-          <w:rFonts w:ascii="Arial" w:hAnsi="Arial" w:cs="Arial"/>
-          <w:sz w:val="20"/>
-          <w:szCs w:val="20"/>
-        </w:rPr>
-        <w:t>any and all</w:t>
-      </w:r>
-      <w:proofErr w:type="gramEnd"/>
-      <w:r>
-        <w:rPr>
-          <w:rFonts w:ascii="Arial" w:hAnsi="Arial" w:cs="Arial"/>
-          <w:sz w:val="20"/>
-          <w:szCs w:val="20"/>
-        </w:rPr>
-        <w:t xml:space="preserve"> such variations and/or departure (however substantial);</w:t>
+        <w:t>, the provisions of this Assignment and/or the Security Documents and the Assignor hereby expressly consents to any and all such variations and/or departure (however substantial);</w:t>
       </w:r>
     </w:p>
     <w:p>
@@ -3710,25 +3628,7 @@
           <w:szCs w:val="20"/>
         </w:rPr>
         <w:tab/>
-        <w:t xml:space="preserve">where SSP transfers its obligations or any part thereof, the Assignor shall execute such documents as are reasonably necessary to release SSP to the extent of the transfer and join the transferee </w:t>
-      </w:r>
-      <w:proofErr w:type="gramStart"/>
-      <w:r>
-        <w:rPr>
-          <w:rFonts w:ascii="Arial" w:hAnsi="Arial" w:cs="Arial"/>
-          <w:sz w:val="20"/>
-          <w:szCs w:val="20"/>
-        </w:rPr>
-        <w:t>as  a</w:t>
-      </w:r>
-      <w:proofErr w:type="gramEnd"/>
-      <w:r>
-        <w:rPr>
-          <w:rFonts w:ascii="Arial" w:hAnsi="Arial" w:cs="Arial"/>
-          <w:sz w:val="20"/>
-          <w:szCs w:val="20"/>
-        </w:rPr>
-        <w:t xml:space="preserve"> party hereto; and </w:t>
+        <w:t xml:space="preserve">where SSP transfers its obligations or any part thereof, the Assignor shall execute such documents as are reasonably necessary to release SSP to the extent of the transfer and join the transferee as  a party hereto; and </w:t>
       </w:r>
     </w:p>
     <w:p>
@@ -4285,25 +4185,7 @@
           <w:sz w:val="20"/>
           <w:szCs w:val="20"/>
         </w:rPr>
-        <w:t xml:space="preserve">under this Assignment shall be paid in full (without any deductions, </w:t>
-      </w:r>
-      <w:proofErr w:type="gramStart"/>
-      <w:r>
-        <w:rPr>
-          <w:rFonts w:ascii="Arial" w:hAnsi="Arial" w:cs="Arial"/>
-          <w:sz w:val="20"/>
-          <w:szCs w:val="20"/>
-        </w:rPr>
-        <w:t>set-off</w:t>
-      </w:r>
-      <w:proofErr w:type="gramEnd"/>
-      <w:r>
-        <w:rPr>
-          <w:rFonts w:ascii="Arial" w:hAnsi="Arial" w:cs="Arial"/>
-          <w:sz w:val="20"/>
-          <w:szCs w:val="20"/>
-        </w:rPr>
-        <w:t xml:space="preserve"> or withholdings). All such sums are exclusive of goods and services tax, or any other tax of similar nature which if payable shall be for the account of the Assignor. If any deduction or withholding is required by law, the Assignor shall forthwith pay to the </w:t>
+        <w:t xml:space="preserve">under this Assignment shall be paid in full (without any deductions, set-off or withholdings). All such sums are exclusive of goods and services tax, or any other tax of similar nature which if payable shall be for the account of the Assignor. If any deduction or withholding is required by law, the Assignor shall forthwith pay to the </w:t>
       </w:r>
       <w:r>
         <w:rPr>
@@ -5428,13 +5310,6 @@
           <w:szCs w:val="20"/>
         </w:rPr>
         <w:tab/>
-      </w:r>
-      <w:r>
-        <w:rPr>
-          <w:rFonts w:ascii="Arial" w:hAnsi="Arial" w:cs="Arial"/>
-          <w:sz w:val="20"/>
-          <w:szCs w:val="20"/>
-        </w:rPr>
         <w:t>______________________________________</w:t>
       </w:r>
     </w:p>
@@ -5726,8 +5601,8 @@
         <w:tblLook w:val="04A0" w:firstRow="1" w:lastRow="0" w:firstColumn="1" w:lastColumn="0" w:noHBand="0" w:noVBand="1"/>
       </w:tblPr>
       <w:tblGrid>
-        <w:gridCol w:w="4513"/>
-        <w:gridCol w:w="4513"/>
+        <w:gridCol w:w="4675"/>
+        <w:gridCol w:w="4675"/>
       </w:tblGrid>
       <w:tr>
         <w:trPr>
@@ -5759,7 +5634,7 @@
                 <w:sz w:val="20"/>
                 <w:szCs w:val="20"/>
               </w:rPr>
-              <w:t>Signed by )</w:t>
+              <w:t>Signed by</w:t>
             </w:r>
           </w:p>
         </w:tc>
@@ -5824,7 +5699,7 @@
                 <w:sz w:val="20"/>
                 <w:szCs w:val="20"/>
               </w:rPr>
-              <w:t>For and on behalf of )</w:t>
+              <w:t>For and on behalf of</w:t>
             </w:r>
           </w:p>
         </w:tc>
@@ -5883,14 +5758,6 @@
                 <w:highlight w:val="yellow"/>
               </w:rPr>
               <w:t>{assignor_company_name}</w:t>
-            </w:r>
-            <w:r>
-              <w:rPr>
-                <w:rFonts w:ascii="Arial" w:hAnsi="Arial"/>
-                <w:sz w:val="20"/>
-                <w:szCs w:val="20"/>
-              </w:rPr>
-              <w:t xml:space="preserve"> )</w:t>
             </w:r>
           </w:p>
         </w:tc>
@@ -7773,13 +7640,6 @@
           <w:szCs w:val="20"/>
         </w:rPr>
         <w:tab/>
-      </w:r>
-      <w:r>
-        <w:rPr>
-          <w:rFonts w:ascii="Arial" w:hAnsi="Arial" w:cs="Arial"/>
-          <w:sz w:val="20"/>
-          <w:szCs w:val="20"/>
-        </w:rPr>
         <w:t xml:space="preserve">: </w:t>
       </w:r>
       <w:r>
@@ -7824,13 +7684,6 @@
           <w:szCs w:val="20"/>
         </w:rPr>
         <w:tab/>
-      </w:r>
-      <w:r>
-        <w:rPr>
-          <w:rFonts w:ascii="Arial" w:hAnsi="Arial" w:cs="Arial"/>
-          <w:sz w:val="20"/>
-          <w:szCs w:val="20"/>
-        </w:rPr>
         <w:t xml:space="preserve">: </w:t>
       </w:r>
       <w:r>
@@ -8103,13 +7956,6 @@
           <w:szCs w:val="20"/>
         </w:rPr>
         <w:tab/>
-      </w:r>
-      <w:r>
-        <w:rPr>
-          <w:rFonts w:ascii="Arial" w:hAnsi="Arial" w:cs="Arial"/>
-          <w:sz w:val="20"/>
-          <w:szCs w:val="20"/>
-        </w:rPr>
         <w:t xml:space="preserve">: </w:t>
       </w:r>
       <w:r>
@@ -8148,13 +7994,6 @@
           <w:szCs w:val="20"/>
         </w:rPr>
         <w:tab/>
-      </w:r>
-      <w:r>
-        <w:rPr>
-          <w:rFonts w:ascii="Arial" w:hAnsi="Arial" w:cs="Arial"/>
-          <w:sz w:val="20"/>
-          <w:szCs w:val="20"/>
-        </w:rPr>
         <w:t xml:space="preserve">: </w:t>
       </w:r>
       <w:r>
@@ -8193,13 +8032,6 @@
           <w:szCs w:val="20"/>
         </w:rPr>
         <w:tab/>
-      </w:r>
-      <w:r>
-        <w:rPr>
-          <w:rFonts w:ascii="Arial" w:hAnsi="Arial" w:cs="Arial"/>
-          <w:sz w:val="20"/>
-          <w:szCs w:val="20"/>
-        </w:rPr>
         <w:t xml:space="preserve">: </w:t>
       </w:r>
       <w:r>
@@ -8409,25 +8241,7 @@
           <w:sz w:val="20"/>
           <w:szCs w:val="20"/>
         </w:rPr>
-        <w:t xml:space="preserve">Payment of all the Receivables into the Designated Account shall be the only valid and effective discharge by you of your obligations to pay the Proceeds to us under our business arrangement and contracts. There shall be no contra or </w:t>
-      </w:r>
-      <w:proofErr w:type="gramStart"/>
-      <w:r>
-        <w:rPr>
-          <w:rFonts w:ascii="Arial" w:hAnsi="Arial" w:cs="Arial"/>
-          <w:sz w:val="20"/>
-          <w:szCs w:val="20"/>
-        </w:rPr>
-        <w:t>set-offs</w:t>
-      </w:r>
-      <w:proofErr w:type="gramEnd"/>
-      <w:r>
-        <w:rPr>
-          <w:rFonts w:ascii="Arial" w:hAnsi="Arial" w:cs="Arial"/>
-          <w:sz w:val="20"/>
-          <w:szCs w:val="20"/>
-        </w:rPr>
-        <w:t xml:space="preserve"> allowed against all the monies and proceeds payable to the Designated Account. </w:t>
+        <w:t xml:space="preserve">Payment of all the Receivables into the Designated Account shall be the only valid and effective discharge by you of your obligations to pay the Proceeds to us under our business arrangement and contracts. There shall be no contra or set-offs allowed against all the monies and proceeds payable to the Designated Account. </w:t>
       </w:r>
     </w:p>
     <w:p>
@@ -8581,13 +8395,6 @@
           <w:szCs w:val="20"/>
         </w:rPr>
         <w:tab/>
-      </w:r>
-      <w:r>
-        <w:rPr>
-          <w:rFonts w:ascii="Arial" w:hAnsi="Arial" w:cs="Arial"/>
-          <w:sz w:val="20"/>
-          <w:szCs w:val="20"/>
-        </w:rPr>
         <w:t xml:space="preserve">: </w:t>
       </w:r>
       <w:r>
@@ -8628,13 +8435,6 @@
           <w:szCs w:val="20"/>
         </w:rPr>
         <w:tab/>
-      </w:r>
-      <w:r>
-        <w:rPr>
-          <w:rFonts w:ascii="Arial" w:hAnsi="Arial" w:cs="Arial"/>
-          <w:sz w:val="20"/>
-          <w:szCs w:val="20"/>
-        </w:rPr>
         <w:t xml:space="preserve">: </w:t>
       </w:r>
       <w:r>
@@ -9070,13 +8870,6 @@
           <w:szCs w:val="20"/>
         </w:rPr>
         <w:tab/>
-      </w:r>
-      <w:r>
-        <w:rPr>
-          <w:rFonts w:ascii="Arial" w:hAnsi="Arial" w:cs="Arial"/>
-          <w:sz w:val="20"/>
-          <w:szCs w:val="20"/>
-        </w:rPr>
         <w:t xml:space="preserve">: </w:t>
       </w:r>
       <w:r>
@@ -9114,13 +8907,6 @@
           <w:szCs w:val="20"/>
         </w:rPr>
         <w:tab/>
-      </w:r>
-      <w:r>
-        <w:rPr>
-          <w:rFonts w:ascii="Arial" w:hAnsi="Arial" w:cs="Arial"/>
-          <w:sz w:val="20"/>
-          <w:szCs w:val="20"/>
-        </w:rPr>
         <w:t xml:space="preserve">: </w:t>
       </w:r>
       <w:r>
@@ -9166,13 +8952,6 @@
           <w:szCs w:val="20"/>
         </w:rPr>
         <w:tab/>
-      </w:r>
-      <w:r>
-        <w:rPr>
-          <w:rFonts w:ascii="Arial" w:hAnsi="Arial" w:cs="Arial"/>
-          <w:sz w:val="20"/>
-          <w:szCs w:val="20"/>
-        </w:rPr>
         <w:t xml:space="preserve">: </w:t>
       </w:r>
       <w:r>
@@ -9319,11 +9098,11 @@
         <w:tblLook w:val="04A0" w:firstRow="1" w:lastRow="0" w:firstColumn="1" w:lastColumn="0" w:noHBand="0" w:noVBand="1"/>
       </w:tblPr>
       <w:tblGrid>
-        <w:gridCol w:w="2965"/>
-        <w:gridCol w:w="1350"/>
-        <w:gridCol w:w="1295"/>
-        <w:gridCol w:w="1870"/>
-        <w:gridCol w:w="1870"/>
+        <w:gridCol w:w="3290"/>
+        <w:gridCol w:w="1591"/>
+        <w:gridCol w:w="910"/>
+        <w:gridCol w:w="1638"/>
+        <w:gridCol w:w="1921"/>
       </w:tblGrid>
       <w:tr>
         <w:tc>

</xml_diff>

<commit_message>
feat: update Deed of Assignment
- Removed merge tags for schedule 2 and 3.
- Schedule 2 turned into a separate notice of assignment template.
</commit_message>
<xml_diff>
--- a/apps/api/src/modules/applications/templates/arf-deed-of-assignment.docx
+++ b/apps/api/src/modules/applications/templates/arf-deed-of-assignment.docx
@@ -1964,7 +1964,25 @@
           <w:sz w:val="20"/>
           <w:szCs w:val="20"/>
         </w:rPr>
-        <w:t xml:space="preserve"> representatives of the Assignor or the Assignor. In this regard, the Assignor agrees that no claims shall be made by the Assignor or on its behalf in respect to any losses, costs and expenses incurred by the Assignor as a result of such </w:t>
+        <w:t xml:space="preserve"> representatives of the Assignor or the Assignor. In this regard, the Assignor agrees that no claims shall be made by the Assignor or on its behalf in respect to any losses, costs and expenses incurred by the Assignor </w:t>
+      </w:r>
+      <w:proofErr w:type="gramStart"/>
+      <w:r>
+        <w:rPr>
+          <w:rFonts w:ascii="Arial" w:hAnsi="Arial" w:cs="Arial"/>
+          <w:sz w:val="20"/>
+          <w:szCs w:val="20"/>
+        </w:rPr>
+        <w:t>as a result of</w:t>
+      </w:r>
+      <w:proofErr w:type="gramEnd"/>
+      <w:r>
+        <w:rPr>
+          <w:rFonts w:ascii="Arial" w:hAnsi="Arial" w:cs="Arial"/>
+          <w:sz w:val="20"/>
+          <w:szCs w:val="20"/>
+        </w:rPr>
+        <w:t xml:space="preserve"> such </w:t>
       </w:r>
       <w:proofErr w:type="spellStart"/>
       <w:r>
@@ -2220,7 +2238,25 @@
           <w:sz w:val="20"/>
           <w:szCs w:val="20"/>
         </w:rPr>
-        <w:t xml:space="preserve"> have not acquired any right of set-off or counter-claim against the Assignor in respect of the Receivables or any portion thereof and the Assignor shall not door omit to do any actor thing which could result in the </w:t>
+        <w:t xml:space="preserve"> have not acquired any right of set-off or </w:t>
+      </w:r>
+      <w:proofErr w:type="gramStart"/>
+      <w:r>
+        <w:rPr>
+          <w:rFonts w:ascii="Arial" w:hAnsi="Arial" w:cs="Arial"/>
+          <w:sz w:val="20"/>
+          <w:szCs w:val="20"/>
+        </w:rPr>
+        <w:t>counter-claim</w:t>
+      </w:r>
+      <w:proofErr w:type="gramEnd"/>
+      <w:r>
+        <w:rPr>
+          <w:rFonts w:ascii="Arial" w:hAnsi="Arial" w:cs="Arial"/>
+          <w:sz w:val="20"/>
+          <w:szCs w:val="20"/>
+        </w:rPr>
+        <w:t xml:space="preserve"> against the Assignor in respect of the Receivables or any portion thereof and the Assignor shall not door omit to do any actor thing which could result in the </w:t>
       </w:r>
       <w:r>
         <w:rPr>
@@ -2306,7 +2342,25 @@
           <w:sz w:val="20"/>
           <w:szCs w:val="20"/>
         </w:rPr>
-        <w:t>that there are no material adverse change in the financial condition, operating environment, management of the Assignor or other conditions which will materially affect the ability of the Assignor to perform its obligations under this Assignment;</w:t>
+        <w:t xml:space="preserve">that there </w:t>
+      </w:r>
+      <w:proofErr w:type="gramStart"/>
+      <w:r>
+        <w:rPr>
+          <w:rFonts w:ascii="Arial" w:hAnsi="Arial" w:cs="Arial"/>
+          <w:sz w:val="20"/>
+          <w:szCs w:val="20"/>
+        </w:rPr>
+        <w:t>are</w:t>
+      </w:r>
+      <w:proofErr w:type="gramEnd"/>
+      <w:r>
+        <w:rPr>
+          <w:rFonts w:ascii="Arial" w:hAnsi="Arial" w:cs="Arial"/>
+          <w:sz w:val="20"/>
+          <w:szCs w:val="20"/>
+        </w:rPr>
+        <w:t xml:space="preserve"> no material adverse change in the financial condition, operating environment, management of the Assignor or other conditions which will materially affect the ability of the Assignor to perform its obligations under this Assignment;</w:t>
       </w:r>
     </w:p>
     <w:p>
@@ -2846,13 +2900,23 @@
         </w:rPr>
         <w:tab/>
       </w:r>
-      <w:r>
-        <w:rPr>
-          <w:rFonts w:ascii="Arial" w:hAnsi="Arial" w:cs="Arial"/>
-          <w:sz w:val="20"/>
-          <w:szCs w:val="20"/>
-        </w:rPr>
-        <w:t xml:space="preserve">For the purpose of this clause, "obligation" includes any obligation whether matured or unmatured, actual or contingent, present or future. If the amount of any such obligation is unascertained, </w:t>
+      <w:proofErr w:type="gramStart"/>
+      <w:r>
+        <w:rPr>
+          <w:rFonts w:ascii="Arial" w:hAnsi="Arial" w:cs="Arial"/>
+          <w:sz w:val="20"/>
+          <w:szCs w:val="20"/>
+        </w:rPr>
+        <w:t>For the purpose of</w:t>
+      </w:r>
+      <w:proofErr w:type="gramEnd"/>
+      <w:r>
+        <w:rPr>
+          <w:rFonts w:ascii="Arial" w:hAnsi="Arial" w:cs="Arial"/>
+          <w:sz w:val="20"/>
+          <w:szCs w:val="20"/>
+        </w:rPr>
+        <w:t xml:space="preserve"> this clause, "obligation" includes any obligation whether matured or unmatured, actual or contingent, present or future. If the amount of any such obligation is unascertained, </w:t>
       </w:r>
       <w:r>
         <w:rPr>
@@ -3080,7 +3144,25 @@
           <w:sz w:val="20"/>
           <w:szCs w:val="20"/>
         </w:rPr>
-        <w:t>, the provisions of this Assignment and/or the Security Documents and the Assignor hereby expressly consents to any and all such variations and/or departure (however substantial);</w:t>
+        <w:t xml:space="preserve">, the provisions of this Assignment and/or the Security Documents and the Assignor hereby expressly consents to </w:t>
+      </w:r>
+      <w:proofErr w:type="gramStart"/>
+      <w:r>
+        <w:rPr>
+          <w:rFonts w:ascii="Arial" w:hAnsi="Arial" w:cs="Arial"/>
+          <w:sz w:val="20"/>
+          <w:szCs w:val="20"/>
+        </w:rPr>
+        <w:t>any and all</w:t>
+      </w:r>
+      <w:proofErr w:type="gramEnd"/>
+      <w:r>
+        <w:rPr>
+          <w:rFonts w:ascii="Arial" w:hAnsi="Arial" w:cs="Arial"/>
+          <w:sz w:val="20"/>
+          <w:szCs w:val="20"/>
+        </w:rPr>
+        <w:t xml:space="preserve"> such variations and/or departure (however substantial);</w:t>
       </w:r>
     </w:p>
     <w:p>
@@ -3628,7 +3710,25 @@
           <w:szCs w:val="20"/>
         </w:rPr>
         <w:tab/>
-        <w:t xml:space="preserve">where SSP transfers its obligations or any part thereof, the Assignor shall execute such documents as are reasonably necessary to release SSP to the extent of the transfer and join the transferee as  a party hereto; and </w:t>
+        <w:t xml:space="preserve">where SSP transfers its obligations or any part thereof, the Assignor shall execute such documents as are reasonably necessary to release SSP to the extent of the transfer and join the transferee </w:t>
+      </w:r>
+      <w:proofErr w:type="gramStart"/>
+      <w:r>
+        <w:rPr>
+          <w:rFonts w:ascii="Arial" w:hAnsi="Arial" w:cs="Arial"/>
+          <w:sz w:val="20"/>
+          <w:szCs w:val="20"/>
+        </w:rPr>
+        <w:t>as  a</w:t>
+      </w:r>
+      <w:proofErr w:type="gramEnd"/>
+      <w:r>
+        <w:rPr>
+          <w:rFonts w:ascii="Arial" w:hAnsi="Arial" w:cs="Arial"/>
+          <w:sz w:val="20"/>
+          <w:szCs w:val="20"/>
+        </w:rPr>
+        <w:t xml:space="preserve"> party hereto; and </w:t>
       </w:r>
     </w:p>
     <w:p>
@@ -4185,7 +4285,25 @@
           <w:sz w:val="20"/>
           <w:szCs w:val="20"/>
         </w:rPr>
-        <w:t xml:space="preserve">under this Assignment shall be paid in full (without any deductions, set-off or withholdings). All such sums are exclusive of goods and services tax, or any other tax of similar nature which if payable shall be for the account of the Assignor. If any deduction or withholding is required by law, the Assignor shall forthwith pay to the </w:t>
+        <w:t xml:space="preserve">under this Assignment shall be paid in full (without any deductions, </w:t>
+      </w:r>
+      <w:proofErr w:type="gramStart"/>
+      <w:r>
+        <w:rPr>
+          <w:rFonts w:ascii="Arial" w:hAnsi="Arial" w:cs="Arial"/>
+          <w:sz w:val="20"/>
+          <w:szCs w:val="20"/>
+        </w:rPr>
+        <w:t>set-off</w:t>
+      </w:r>
+      <w:proofErr w:type="gramEnd"/>
+      <w:r>
+        <w:rPr>
+          <w:rFonts w:ascii="Arial" w:hAnsi="Arial" w:cs="Arial"/>
+          <w:sz w:val="20"/>
+          <w:szCs w:val="20"/>
+        </w:rPr>
+        <w:t xml:space="preserve"> or withholdings). All such sums are exclusive of goods and services tax, or any other tax of similar nature which if payable shall be for the account of the Assignor. If any deduction or withholding is required by law, the Assignor shall forthwith pay to the </w:t>
       </w:r>
       <w:r>
         <w:rPr>
@@ -5310,6 +5428,13 @@
           <w:szCs w:val="20"/>
         </w:rPr>
         <w:tab/>
+      </w:r>
+      <w:r>
+        <w:rPr>
+          <w:rFonts w:ascii="Arial" w:hAnsi="Arial" w:cs="Arial"/>
+          <w:sz w:val="20"/>
+          <w:szCs w:val="20"/>
+        </w:rPr>
         <w:t>______________________________________</w:t>
       </w:r>
     </w:p>
@@ -5601,8 +5726,8 @@
         <w:tblLook w:val="04A0" w:firstRow="1" w:lastRow="0" w:firstColumn="1" w:lastColumn="0" w:noHBand="0" w:noVBand="1"/>
       </w:tblPr>
       <w:tblGrid>
-        <w:gridCol w:w="4675"/>
-        <w:gridCol w:w="4675"/>
+        <w:gridCol w:w="4513"/>
+        <w:gridCol w:w="4513"/>
       </w:tblGrid>
       <w:tr>
         <w:trPr>
@@ -5634,7 +5759,7 @@
                 <w:sz w:val="20"/>
                 <w:szCs w:val="20"/>
               </w:rPr>
-              <w:t>Signed by</w:t>
+              <w:t>Signed by )</w:t>
             </w:r>
           </w:p>
         </w:tc>
@@ -5699,7 +5824,7 @@
                 <w:sz w:val="20"/>
                 <w:szCs w:val="20"/>
               </w:rPr>
-              <w:t>For and on behalf of</w:t>
+              <w:t>For and on behalf of )</w:t>
             </w:r>
           </w:p>
         </w:tc>
@@ -5758,6 +5883,14 @@
                 <w:highlight w:val="yellow"/>
               </w:rPr>
               <w:t>{assignor_company_name}</w:t>
+            </w:r>
+            <w:r>
+              <w:rPr>
+                <w:rFonts w:ascii="Arial" w:hAnsi="Arial"/>
+                <w:sz w:val="20"/>
+                <w:szCs w:val="20"/>
+              </w:rPr>
+              <w:t xml:space="preserve"> )</w:t>
             </w:r>
           </w:p>
         </w:tc>
@@ -7640,24 +7773,7 @@
           <w:szCs w:val="20"/>
         </w:rPr>
         <w:tab/>
-        <w:t xml:space="preserve">: </w:t>
-      </w:r>
-      <w:r>
-        <w:rPr>
-          <w:rFonts w:ascii="Arial" w:hAnsi="Arial" w:cs="Arial"/>
-          <w:sz w:val="20"/>
-          <w:szCs w:val="20"/>
-          <w:highlight w:val="yellow"/>
-        </w:rPr>
-        <w:t>{notice_date}</w:t>
-      </w:r>
-      <w:r>
-        <w:rPr>
-          <w:rFonts w:ascii="Arial" w:hAnsi="Arial" w:cs="Arial"/>
-          <w:sz w:val="20"/>
-          <w:szCs w:val="20"/>
-        </w:rPr>
-        <w:t xml:space="preserve"> </w:t>
+        <w:t xml:space="preserve">: [insert date] </w:t>
       </w:r>
     </w:p>
     <w:p>
@@ -7684,41 +7800,23 @@
           <w:szCs w:val="20"/>
         </w:rPr>
         <w:tab/>
-        <w:t xml:space="preserve">: </w:t>
-      </w:r>
-      <w:r>
-        <w:rPr>
-          <w:rFonts w:ascii="Arial" w:hAnsi="Arial" w:cs="Arial"/>
-          <w:sz w:val="20"/>
-          <w:szCs w:val="20"/>
-          <w:highlight w:val="yellow"/>
-        </w:rPr>
-        <w:t>{debtor_company_name}</w:t>
-      </w:r>
-      <w:r>
-        <w:rPr>
-          <w:rFonts w:ascii="Arial" w:hAnsi="Arial" w:cs="Arial"/>
-          <w:sz w:val="20"/>
-          <w:szCs w:val="20"/>
-        </w:rPr>
-        <w:t xml:space="preserve">, </w:t>
-      </w:r>
-      <w:r>
-        <w:rPr>
-          <w:rFonts w:ascii="Arial" w:hAnsi="Arial" w:cs="Arial"/>
-          <w:sz w:val="20"/>
-          <w:szCs w:val="20"/>
-          <w:highlight w:val="yellow"/>
-        </w:rPr>
-        <w:t>{debtor_address}</w:t>
-      </w:r>
-      <w:r>
-        <w:rPr>
-          <w:rFonts w:ascii="Arial" w:hAnsi="Arial" w:cs="Arial"/>
-          <w:sz w:val="20"/>
-          <w:szCs w:val="20"/>
-        </w:rPr>
-        <w:t xml:space="preserve"> </w:t>
+        <w:t xml:space="preserve">: [Name &amp; Address of </w:t>
+      </w:r>
+      <w:r>
+        <w:rPr>
+          <w:rFonts w:ascii="Arial" w:hAnsi="Arial" w:cs="Arial"/>
+          <w:sz w:val="20"/>
+          <w:szCs w:val="20"/>
+        </w:rPr>
+        <w:t>Debtor</w:t>
+      </w:r>
+      <w:r>
+        <w:rPr>
+          <w:rFonts w:ascii="Arial" w:hAnsi="Arial" w:cs="Arial"/>
+          <w:sz w:val="20"/>
+          <w:szCs w:val="20"/>
+        </w:rPr>
+        <w:t xml:space="preserve">] </w:t>
       </w:r>
     </w:p>
     <w:p>
@@ -7746,16 +7844,7 @@
           <w:sz w:val="20"/>
           <w:szCs w:val="20"/>
         </w:rPr>
-        <w:t xml:space="preserve">Attn: </w:t>
-      </w:r>
-      <w:r>
-        <w:rPr>
-          <w:rFonts w:ascii="Arial" w:hAnsi="Arial" w:cs="Arial"/>
-          <w:sz w:val="20"/>
-          <w:szCs w:val="20"/>
-          <w:highlight w:val="yellow"/>
-        </w:rPr>
-        <w:t>{debtor_attention}</w:t>
+        <w:t>Attn:</w:t>
       </w:r>
     </w:p>
     <w:p>
@@ -7827,24 +7916,195 @@
           <w:sz w:val="20"/>
           <w:szCs w:val="20"/>
         </w:rPr>
-        <w:t xml:space="preserve">We hereby notify you that we have, effective from </w:t>
-      </w:r>
-      <w:r>
-        <w:rPr>
-          <w:rFonts w:ascii="Arial" w:hAnsi="Arial" w:cs="Arial"/>
-          <w:sz w:val="20"/>
-          <w:szCs w:val="20"/>
-          <w:highlight w:val="yellow"/>
-        </w:rPr>
-        <w:t>{assignment_date}</w:t>
-      </w:r>
-      <w:r>
-        <w:rPr>
-          <w:rFonts w:ascii="Arial" w:hAnsi="Arial" w:cs="Arial"/>
-          <w:sz w:val="20"/>
-          <w:szCs w:val="20"/>
-        </w:rPr>
-        <w:t xml:space="preserve">, by an assignment of receivables entered into between ourselves and Shoraka Suyula Platform Sdn. Bhd. assigned absolutely and irrevocably all proceeds, all trade debts, all rights, title, interests and benefit, whether present and future (“Receivables”), including but not limited to those listed in the statement of accounts as attached to this Notice of Assignment to Shoraka Suyula Platform Sdn. Bhd. for and on behalf of all Investors. </w:t>
+        <w:t xml:space="preserve">We hereby notify you that we have, effective from [insert], by an assignment of receivables </w:t>
+      </w:r>
+      <w:proofErr w:type="gramStart"/>
+      <w:r>
+        <w:rPr>
+          <w:rFonts w:ascii="Arial" w:hAnsi="Arial" w:cs="Arial"/>
+          <w:sz w:val="20"/>
+          <w:szCs w:val="20"/>
+        </w:rPr>
+        <w:t>entered into</w:t>
+      </w:r>
+      <w:proofErr w:type="gramEnd"/>
+      <w:r>
+        <w:rPr>
+          <w:rFonts w:ascii="Arial" w:hAnsi="Arial" w:cs="Arial"/>
+          <w:sz w:val="20"/>
+          <w:szCs w:val="20"/>
+        </w:rPr>
+        <w:t xml:space="preserve"> between ourselves and </w:t>
+      </w:r>
+      <w:proofErr w:type="spellStart"/>
+      <w:r>
+        <w:rPr>
+          <w:rFonts w:ascii="Arial" w:hAnsi="Arial" w:cs="Arial"/>
+          <w:sz w:val="20"/>
+          <w:szCs w:val="20"/>
+        </w:rPr>
+        <w:t>Shoraka</w:t>
+      </w:r>
+      <w:proofErr w:type="spellEnd"/>
+      <w:r>
+        <w:rPr>
+          <w:rFonts w:ascii="Arial" w:hAnsi="Arial" w:cs="Arial"/>
+          <w:sz w:val="20"/>
+          <w:szCs w:val="20"/>
+        </w:rPr>
+        <w:t xml:space="preserve"> </w:t>
+      </w:r>
+      <w:proofErr w:type="spellStart"/>
+      <w:r>
+        <w:rPr>
+          <w:rFonts w:ascii="Arial" w:hAnsi="Arial" w:cs="Arial"/>
+          <w:sz w:val="20"/>
+          <w:szCs w:val="20"/>
+        </w:rPr>
+        <w:t>Suyula</w:t>
+      </w:r>
+      <w:proofErr w:type="spellEnd"/>
+      <w:r>
+        <w:rPr>
+          <w:rFonts w:ascii="Arial" w:hAnsi="Arial" w:cs="Arial"/>
+          <w:sz w:val="20"/>
+          <w:szCs w:val="20"/>
+        </w:rPr>
+        <w:t xml:space="preserve"> Platform </w:t>
+      </w:r>
+      <w:proofErr w:type="spellStart"/>
+      <w:r>
+        <w:rPr>
+          <w:rFonts w:ascii="Arial" w:hAnsi="Arial" w:cs="Arial"/>
+          <w:sz w:val="20"/>
+          <w:szCs w:val="20"/>
+        </w:rPr>
+        <w:t>Sdn</w:t>
+      </w:r>
+      <w:proofErr w:type="spellEnd"/>
+      <w:r>
+        <w:rPr>
+          <w:rFonts w:ascii="Arial" w:hAnsi="Arial" w:cs="Arial"/>
+          <w:sz w:val="20"/>
+          <w:szCs w:val="20"/>
+        </w:rPr>
+        <w:t xml:space="preserve">. Bhd. </w:t>
+      </w:r>
+      <w:r>
+        <w:rPr>
+          <w:rFonts w:ascii="Arial" w:hAnsi="Arial" w:cs="Arial"/>
+          <w:sz w:val="20"/>
+          <w:szCs w:val="20"/>
+        </w:rPr>
+        <w:t>a</w:t>
+      </w:r>
+      <w:r>
+        <w:rPr>
+          <w:rFonts w:ascii="Arial" w:hAnsi="Arial" w:cs="Arial"/>
+          <w:sz w:val="20"/>
+          <w:szCs w:val="20"/>
+        </w:rPr>
+        <w:t>ssigned absolutely</w:t>
+      </w:r>
+      <w:r>
+        <w:rPr>
+          <w:rFonts w:ascii="Arial" w:hAnsi="Arial" w:cs="Arial"/>
+          <w:sz w:val="20"/>
+          <w:szCs w:val="20"/>
+        </w:rPr>
+        <w:t xml:space="preserve"> and irrevocably all proceeds, all trade debts, all rights, title, interests and benefit, whether present and future (“</w:t>
+      </w:r>
+      <w:r>
+        <w:rPr>
+          <w:rFonts w:ascii="Arial" w:hAnsi="Arial" w:cs="Arial"/>
+          <w:b/>
+          <w:bCs/>
+          <w:sz w:val="20"/>
+          <w:szCs w:val="20"/>
+        </w:rPr>
+        <w:t>Receivables</w:t>
+      </w:r>
+      <w:r>
+        <w:rPr>
+          <w:rFonts w:ascii="Arial" w:hAnsi="Arial" w:cs="Arial"/>
+          <w:sz w:val="20"/>
+          <w:szCs w:val="20"/>
+        </w:rPr>
+        <w:t xml:space="preserve">”), including but not limited to those listed in the statement of accounts as attached to this Notice of Assignment to </w:t>
+      </w:r>
+      <w:proofErr w:type="spellStart"/>
+      <w:r>
+        <w:rPr>
+          <w:rFonts w:ascii="Arial" w:hAnsi="Arial" w:cs="Arial"/>
+          <w:b/>
+          <w:bCs/>
+          <w:sz w:val="20"/>
+          <w:szCs w:val="20"/>
+        </w:rPr>
+        <w:t>Shoraka</w:t>
+      </w:r>
+      <w:proofErr w:type="spellEnd"/>
+      <w:r>
+        <w:rPr>
+          <w:rFonts w:ascii="Arial" w:hAnsi="Arial" w:cs="Arial"/>
+          <w:b/>
+          <w:bCs/>
+          <w:sz w:val="20"/>
+          <w:szCs w:val="20"/>
+        </w:rPr>
+        <w:t xml:space="preserve"> </w:t>
+      </w:r>
+      <w:proofErr w:type="spellStart"/>
+      <w:r>
+        <w:rPr>
+          <w:rFonts w:ascii="Arial" w:hAnsi="Arial" w:cs="Arial"/>
+          <w:b/>
+          <w:bCs/>
+          <w:sz w:val="20"/>
+          <w:szCs w:val="20"/>
+        </w:rPr>
+        <w:t>Suyula</w:t>
+      </w:r>
+      <w:proofErr w:type="spellEnd"/>
+      <w:r>
+        <w:rPr>
+          <w:rFonts w:ascii="Arial" w:hAnsi="Arial" w:cs="Arial"/>
+          <w:b/>
+          <w:bCs/>
+          <w:sz w:val="20"/>
+          <w:szCs w:val="20"/>
+        </w:rPr>
+        <w:t xml:space="preserve"> Platform </w:t>
+      </w:r>
+      <w:proofErr w:type="spellStart"/>
+      <w:r>
+        <w:rPr>
+          <w:rFonts w:ascii="Arial" w:hAnsi="Arial" w:cs="Arial"/>
+          <w:b/>
+          <w:bCs/>
+          <w:sz w:val="20"/>
+          <w:szCs w:val="20"/>
+        </w:rPr>
+        <w:t>Sdn</w:t>
+      </w:r>
+      <w:proofErr w:type="spellEnd"/>
+      <w:r>
+        <w:rPr>
+          <w:rFonts w:ascii="Arial" w:hAnsi="Arial" w:cs="Arial"/>
+          <w:b/>
+          <w:bCs/>
+          <w:sz w:val="20"/>
+          <w:szCs w:val="20"/>
+        </w:rPr>
+        <w:t>. Bhd.</w:t>
+      </w:r>
+      <w:r>
+        <w:rPr>
+          <w:rFonts w:ascii="Arial" w:hAnsi="Arial" w:cs="Arial"/>
+          <w:sz w:val="20"/>
+          <w:szCs w:val="20"/>
+        </w:rPr>
+        <w:t xml:space="preserve"> for and on behalf of all Investors. </w:t>
       </w:r>
     </w:p>
     <w:p>
@@ -7956,16 +8216,7 @@
           <w:szCs w:val="20"/>
         </w:rPr>
         <w:tab/>
-        <w:t xml:space="preserve">: </w:t>
-      </w:r>
-      <w:r>
-        <w:rPr>
-          <w:rFonts w:ascii="Arial" w:hAnsi="Arial" w:cs="Arial"/>
-          <w:sz w:val="20"/>
-          <w:szCs w:val="20"/>
-          <w:highlight w:val="yellow"/>
-        </w:rPr>
-        <w:t>{trust_account_name}</w:t>
+        <w:t>: [Insert]</w:t>
       </w:r>
     </w:p>
     <w:p>
@@ -8001,9 +8252,8 @@
           <w:rFonts w:ascii="Arial" w:hAnsi="Arial" w:cs="Arial"/>
           <w:sz w:val="20"/>
           <w:szCs w:val="20"/>
-          <w:highlight w:val="yellow"/>
-        </w:rPr>
-        <w:t>{trust_bank_name}</w:t>
+        </w:rPr>
+        <w:t>[Insert]</w:t>
       </w:r>
     </w:p>
     <w:p>
@@ -8039,9 +8289,8 @@
           <w:rFonts w:ascii="Arial" w:hAnsi="Arial" w:cs="Arial"/>
           <w:sz w:val="20"/>
           <w:szCs w:val="20"/>
-          <w:highlight w:val="yellow"/>
-        </w:rPr>
-        <w:t>{trust_account_number}</w:t>
+        </w:rPr>
+        <w:t>[Insert]</w:t>
       </w:r>
     </w:p>
     <w:p>
@@ -8241,7 +8490,25 @@
           <w:sz w:val="20"/>
           <w:szCs w:val="20"/>
         </w:rPr>
-        <w:t xml:space="preserve">Payment of all the Receivables into the Designated Account shall be the only valid and effective discharge by you of your obligations to pay the Proceeds to us under our business arrangement and contracts. There shall be no contra or set-offs allowed against all the monies and proceeds payable to the Designated Account. </w:t>
+        <w:t xml:space="preserve">Payment of all the Receivables into the Designated Account shall be the only valid and effective discharge by you of your obligations to pay the Proceeds to us under our business arrangement and contracts. There shall be no contra or </w:t>
+      </w:r>
+      <w:proofErr w:type="gramStart"/>
+      <w:r>
+        <w:rPr>
+          <w:rFonts w:ascii="Arial" w:hAnsi="Arial" w:cs="Arial"/>
+          <w:sz w:val="20"/>
+          <w:szCs w:val="20"/>
+        </w:rPr>
+        <w:t>set-offs</w:t>
+      </w:r>
+      <w:proofErr w:type="gramEnd"/>
+      <w:r>
+        <w:rPr>
+          <w:rFonts w:ascii="Arial" w:hAnsi="Arial" w:cs="Arial"/>
+          <w:sz w:val="20"/>
+          <w:szCs w:val="20"/>
+        </w:rPr>
+        <w:t xml:space="preserve"> allowed against all the monies and proceeds payable to the Designated Account. </w:t>
       </w:r>
     </w:p>
     <w:p>
@@ -8395,16 +8662,7 @@
           <w:szCs w:val="20"/>
         </w:rPr>
         <w:tab/>
-        <w:t xml:space="preserve">: </w:t>
-      </w:r>
-      <w:r>
-        <w:rPr>
-          <w:rFonts w:ascii="Arial" w:hAnsi="Arial" w:cs="Arial"/>
-          <w:sz w:val="20"/>
-          <w:szCs w:val="20"/>
-          <w:highlight w:val="yellow"/>
-        </w:rPr>
-        <w:t>{notice_signatory_name}</w:t>
+        <w:t>:</w:t>
       </w:r>
     </w:p>
     <w:p>
@@ -8435,16 +8693,7 @@
           <w:szCs w:val="20"/>
         </w:rPr>
         <w:tab/>
-        <w:t xml:space="preserve">: </w:t>
-      </w:r>
-      <w:r>
-        <w:rPr>
-          <w:rFonts w:ascii="Arial" w:hAnsi="Arial" w:cs="Arial"/>
-          <w:sz w:val="20"/>
-          <w:szCs w:val="20"/>
-          <w:highlight w:val="yellow"/>
-        </w:rPr>
-        <w:t>{notice_signatory_designation}</w:t>
+        <w:t>:</w:t>
       </w:r>
     </w:p>
     <w:p>
@@ -8633,41 +8882,25 @@
           <w:sz w:val="20"/>
           <w:szCs w:val="20"/>
         </w:rPr>
-        <w:t>I/We confirm that current balance as stated in the statement of account attached with outstanding of RM</w:t>
-      </w:r>
-      <w:r>
-        <w:rPr>
-          <w:rFonts w:ascii="Arial" w:hAnsi="Arial" w:cs="Arial"/>
-          <w:sz w:val="20"/>
-          <w:szCs w:val="20"/>
-          <w:highlight w:val="yellow"/>
-        </w:rPr>
-        <w:t>{outstanding_amount}</w:t>
-      </w:r>
-      <w:r>
-        <w:rPr>
-          <w:rFonts w:ascii="Arial" w:hAnsi="Arial" w:cs="Arial"/>
-          <w:sz w:val="20"/>
-          <w:szCs w:val="20"/>
-        </w:rPr>
-        <w:t xml:space="preserve"> as at </w:t>
-      </w:r>
-      <w:r>
-        <w:rPr>
-          <w:rFonts w:ascii="Arial" w:hAnsi="Arial" w:cs="Arial"/>
-          <w:sz w:val="20"/>
-          <w:szCs w:val="20"/>
-          <w:highlight w:val="yellow"/>
-        </w:rPr>
-        <w:t>{balance_as_of_date}</w:t>
-      </w:r>
-      <w:r>
-        <w:rPr>
-          <w:rFonts w:ascii="Arial" w:hAnsi="Arial" w:cs="Arial"/>
-          <w:sz w:val="20"/>
-          <w:szCs w:val="20"/>
-        </w:rPr>
-        <w:t xml:space="preserve"> is correct and I/We agree and undertake that we shall remit the amount outstanding and all other future Receivables to the Designated Account above. I/We agree that from the date of the Notice of Assignment herein all the present and future Receivables shall not be subjected to any contra or set-offs. </w:t>
+        <w:t xml:space="preserve">I/We confirm that current balance as stated in the statement of account attached with outstanding of RM_____________ as at ________________ is correct and I/We agree and undertake that we shall remit the amount outstanding and all other future Receivables to the Designated Account above. I/We agree that from the date of the Notice of Assignment herein all the present and future Receivables shall not be subjected to any contra or </w:t>
+      </w:r>
+      <w:proofErr w:type="gramStart"/>
+      <w:r>
+        <w:rPr>
+          <w:rFonts w:ascii="Arial" w:hAnsi="Arial" w:cs="Arial"/>
+          <w:sz w:val="20"/>
+          <w:szCs w:val="20"/>
+        </w:rPr>
+        <w:t>set-offs</w:t>
+      </w:r>
+      <w:proofErr w:type="gramEnd"/>
+      <w:r>
+        <w:rPr>
+          <w:rFonts w:ascii="Arial" w:hAnsi="Arial" w:cs="Arial"/>
+          <w:sz w:val="20"/>
+          <w:szCs w:val="20"/>
+        </w:rPr>
+        <w:t xml:space="preserve">. </w:t>
       </w:r>
     </w:p>
     <w:p>
@@ -8715,9 +8948,8 @@
           <w:rFonts w:ascii="Arial" w:hAnsi="Arial" w:cs="Arial"/>
           <w:sz w:val="20"/>
           <w:szCs w:val="20"/>
-          <w:highlight w:val="yellow"/>
-        </w:rPr>
-        <w:t>{debtor_company_name}</w:t>
+        </w:rPr>
+        <w:t>[Company Name]</w:t>
       </w:r>
     </w:p>
     <w:p>
@@ -8736,24 +8968,7 @@
           <w:sz w:val="20"/>
           <w:szCs w:val="20"/>
         </w:rPr>
-        <w:t xml:space="preserve">(Registration No. </w:t>
-      </w:r>
-      <w:r>
-        <w:rPr>
-          <w:rFonts w:ascii="Arial" w:hAnsi="Arial" w:cs="Arial"/>
-          <w:sz w:val="20"/>
-          <w:szCs w:val="20"/>
-          <w:highlight w:val="yellow"/>
-        </w:rPr>
-        <w:t>{debtor_registration_number}</w:t>
-      </w:r>
-      <w:r>
-        <w:rPr>
-          <w:rFonts w:ascii="Arial" w:hAnsi="Arial" w:cs="Arial"/>
-          <w:sz w:val="20"/>
-          <w:szCs w:val="20"/>
-        </w:rPr>
-        <w:t>)</w:t>
+        <w:t xml:space="preserve">(Registration No.) </w:t>
       </w:r>
     </w:p>
     <w:p>
@@ -8870,16 +9085,7 @@
           <w:szCs w:val="20"/>
         </w:rPr>
         <w:tab/>
-        <w:t xml:space="preserve">: </w:t>
-      </w:r>
-      <w:r>
-        <w:rPr>
-          <w:rFonts w:ascii="Arial" w:hAnsi="Arial" w:cs="Arial"/>
-          <w:sz w:val="20"/>
-          <w:szCs w:val="20"/>
-          <w:highlight w:val="yellow"/>
-        </w:rPr>
-        <w:t>{debtor_signatory_name}</w:t>
+        <w:t>:</w:t>
       </w:r>
     </w:p>
     <w:p>
@@ -8907,16 +9113,7 @@
           <w:szCs w:val="20"/>
         </w:rPr>
         <w:tab/>
-        <w:t xml:space="preserve">: </w:t>
-      </w:r>
-      <w:r>
-        <w:rPr>
-          <w:rFonts w:ascii="Arial" w:hAnsi="Arial" w:cs="Arial"/>
-          <w:sz w:val="20"/>
-          <w:szCs w:val="20"/>
-          <w:highlight w:val="yellow"/>
-        </w:rPr>
-        <w:t>{debtor_signatory_designation}</w:t>
+        <w:t>:</w:t>
       </w:r>
     </w:p>
     <w:p>
@@ -8952,16 +9149,7 @@
           <w:szCs w:val="20"/>
         </w:rPr>
         <w:tab/>
-        <w:t xml:space="preserve">: </w:t>
-      </w:r>
-      <w:r>
-        <w:rPr>
-          <w:rFonts w:ascii="Arial" w:hAnsi="Arial" w:cs="Arial"/>
-          <w:sz w:val="20"/>
-          <w:szCs w:val="20"/>
-          <w:highlight w:val="yellow"/>
-        </w:rPr>
-        <w:t>{acknowledgement_date}</w:t>
+        <w:t>:</w:t>
       </w:r>
     </w:p>
     <w:p>
@@ -9098,11 +9286,11 @@
         <w:tblLook w:val="04A0" w:firstRow="1" w:lastRow="0" w:firstColumn="1" w:lastColumn="0" w:noHBand="0" w:noVBand="1"/>
       </w:tblPr>
       <w:tblGrid>
-        <w:gridCol w:w="3290"/>
-        <w:gridCol w:w="1591"/>
-        <w:gridCol w:w="910"/>
-        <w:gridCol w:w="1638"/>
-        <w:gridCol w:w="1921"/>
+        <w:gridCol w:w="2965"/>
+        <w:gridCol w:w="1350"/>
+        <w:gridCol w:w="1295"/>
+        <w:gridCol w:w="1870"/>
+        <w:gridCol w:w="1870"/>
       </w:tblGrid>
       <w:tr>
         <w:tc>
@@ -9290,15 +9478,15 @@
       <w:tr>
         <w:tc>
           <w:tcPr>
-            <w:tcW w:w="2965" w:type="dxa"/>
+            <w:tcW w:w="9350" w:type="dxa"/>
+            <w:gridSpan w:val="5"/>
           </w:tcPr>
           <w:p>
             <w:pPr>
-              <w:jc w:val="center"/>
-              <w:rPr>
-                <w:rFonts w:ascii="Arial" w:hAnsi="Arial" w:cs="Arial"/>
-                <w:b/>
-                <w:bCs/>
+              <w:spacing w:line="360" w:lineRule="auto"/>
+              <w:jc w:val="both"/>
+              <w:rPr>
+                <w:rFonts w:ascii="Arial" w:hAnsi="Arial"/>
                 <w:sz w:val="20"/>
                 <w:szCs w:val="20"/>
               </w:rPr>
@@ -9309,128 +9497,7 @@
                 <w:sz w:val="20"/>
                 <w:szCs w:val="20"/>
               </w:rPr>
-              <w:t>{#transaction_documents}</w:t>
-            </w:r>
-            <w:r>
-              <w:rPr>
-                <w:rFonts w:ascii="Arial" w:hAnsi="Arial"/>
-                <w:sz w:val="20"/>
-                <w:szCs w:val="20"/>
-                <w:highlight w:val="yellow"/>
-              </w:rPr>
-              <w:t>{transaction_document_name_number}</w:t>
-            </w:r>
-          </w:p>
-        </w:tc>
-        <w:tc>
-          <w:tcPr>
-            <w:tcW w:w="1350" w:type="dxa"/>
-          </w:tcPr>
-          <w:p>
-            <w:pPr>
-              <w:jc w:val="center"/>
-              <w:rPr>
-                <w:rFonts w:ascii="Arial" w:hAnsi="Arial" w:cs="Arial"/>
-                <w:b/>
-                <w:bCs/>
-                <w:sz w:val="20"/>
-                <w:szCs w:val="20"/>
-              </w:rPr>
-            </w:pPr>
-            <w:r>
-              <w:rPr>
-                <w:rFonts w:ascii="Arial" w:hAnsi="Arial"/>
-                <w:sz w:val="20"/>
-                <w:szCs w:val="20"/>
-                <w:highlight w:val="yellow"/>
-              </w:rPr>
-              <w:t>{transaction_document_date}</w:t>
-            </w:r>
-          </w:p>
-        </w:tc>
-        <w:tc>
-          <w:tcPr>
-            <w:tcW w:w="1295" w:type="dxa"/>
-          </w:tcPr>
-          <w:p>
-            <w:pPr>
-              <w:jc w:val="center"/>
-              <w:rPr>
-                <w:rFonts w:ascii="Arial" w:hAnsi="Arial" w:cs="Arial"/>
-                <w:b/>
-                <w:bCs/>
-                <w:sz w:val="20"/>
-                <w:szCs w:val="20"/>
-              </w:rPr>
-            </w:pPr>
-            <w:r>
-              <w:rPr>
-                <w:rFonts w:ascii="Arial" w:hAnsi="Arial"/>
-                <w:sz w:val="20"/>
-                <w:szCs w:val="20"/>
-                <w:highlight w:val="yellow"/>
-              </w:rPr>
-              <w:t>{debtor_name}</w:t>
-            </w:r>
-          </w:p>
-        </w:tc>
-        <w:tc>
-          <w:tcPr>
-            <w:tcW w:w="1870" w:type="dxa"/>
-          </w:tcPr>
-          <w:p>
-            <w:pPr>
-              <w:jc w:val="center"/>
-              <w:rPr>
-                <w:rFonts w:ascii="Arial" w:hAnsi="Arial" w:cs="Arial"/>
-                <w:b/>
-                <w:bCs/>
-                <w:sz w:val="20"/>
-                <w:szCs w:val="20"/>
-              </w:rPr>
-            </w:pPr>
-            <w:r>
-              <w:rPr>
-                <w:rFonts w:ascii="Arial" w:hAnsi="Arial"/>
-                <w:sz w:val="20"/>
-                <w:szCs w:val="20"/>
-                <w:highlight w:val="yellow"/>
-              </w:rPr>
-              <w:t>{transaction_document_value}</w:t>
-            </w:r>
-          </w:p>
-        </w:tc>
-        <w:tc>
-          <w:tcPr>
-            <w:tcW w:w="1870" w:type="dxa"/>
-          </w:tcPr>
-          <w:p>
-            <w:pPr>
-              <w:jc w:val="center"/>
-              <w:rPr>
-                <w:rFonts w:ascii="Arial" w:hAnsi="Arial" w:cs="Arial"/>
-                <w:b/>
-                <w:bCs/>
-                <w:sz w:val="20"/>
-                <w:szCs w:val="20"/>
-              </w:rPr>
-            </w:pPr>
-            <w:r>
-              <w:rPr>
-                <w:rFonts w:ascii="Arial" w:hAnsi="Arial"/>
-                <w:sz w:val="20"/>
-                <w:szCs w:val="20"/>
-                <w:highlight w:val="yellow"/>
-              </w:rPr>
-              <w:t>{due_date}</w:t>
-            </w:r>
-            <w:r>
-              <w:rPr>
-                <w:rFonts w:ascii="Arial" w:hAnsi="Arial"/>
-                <w:sz w:val="20"/>
-                <w:szCs w:val="20"/>
-              </w:rPr>
-              <w:t>{/transaction_documents}</w:t>
+              <w:t>Nil as at the date of execution; to be supplemented from time to time in accordance with Clause 4.4.</w:t>
             </w:r>
           </w:p>
         </w:tc>

</xml_diff>